<commit_message>
bd: fijar MySQL 9.7 LTS, mejorar el script de migraciones y registrar ADR-0008
</commit_message>
<xml_diff>
--- a/docs/informe/SGIP_Informe_Inicio_Proyecto.docx
+++ b/docs/informe/SGIP_Informe_Inicio_Proyecto.docx
@@ -6322,7 +6322,7 @@
                 <w:sz w:val="20"/>
                 <w:szCs w:val="20"/>
               </w:rPr>
-              <w:t xml:space="preserve">MySQL 8.0</w:t>
+              <w:t xml:space="preserve">MySQL 9.7 LTS</w:t>
             </w:r>
           </w:p>
         </w:tc>
@@ -6358,7 +6358,7 @@
                 <w:sz w:val="20"/>
                 <w:szCs w:val="20"/>
               </w:rPr>
-              <w:t xml:space="preserve">Motor relacional con soporte de columnas generadas y transacciones, ya empleado en la fase previa.</w:t>
+              <w:t xml:space="preserve">Motor relacional con soporte de columnas generadas, restricciones de verificación y transacciones. Se elige la vía de soporte extendido y no la de innovación, para que la versión no cambie durante el desarrollo.</w:t>
             </w:r>
           </w:p>
         </w:tc>
@@ -41458,7 +41458,7 @@
                 <w:sz w:val="20"/>
                 <w:szCs w:val="20"/>
               </w:rPr>
-              <w:t xml:space="preserve">Motor MySQL 8.0 y cliente de administración</w:t>
+              <w:t xml:space="preserve">Motor MySQL 9.7 LTS y MySQL Workbench</w:t>
             </w:r>
           </w:p>
         </w:tc>
@@ -41494,7 +41494,7 @@
                 <w:sz w:val="20"/>
                 <w:szCs w:val="20"/>
               </w:rPr>
-              <w:t xml:space="preserve">Disponible</w:t>
+              <w:t xml:space="preserve">Instalado y verificado</w:t>
             </w:r>
           </w:p>
         </w:tc>

</xml_diff>